<commit_message>
Remove status wording from guides; ONBOARDING.md is now an index; drop interactive guide.html
</commit_message>
<xml_diff>
--- a/onboarding/AIX-Lab-Atlas-Onboarding-QuickStart.docx
+++ b/onboarding/AIX-Lab-Atlas-Onboarding-QuickStart.docx
@@ -209,7 +209,7 @@
               <w:t xml:space="preserve">Track 1:</w:t>
             </w:r>
             <w:r>
-              <w:t xml:space="preserve"> Claude desktop app and a paid Claude plan (or a Console account). Windows also needs Git for Windows or WSL (UNVERIFIED)</w:t>
+              <w:t xml:space="preserve"> Claude desktop app and a paid Claude plan (or a Console account). Windows also needs Git for Windows or WSL (not tested yet)</w:t>
             </w:r>
           </w:p>
         </w:tc>
@@ -1000,7 +1000,7 @@
         <w:t xml:space="preserve">/help</w:t>
       </w:r>
       <w:r>
-        <w:t xml:space="preserve"> opens Claude's own help, use the sentence above. Windows (UNVERIFIED): use WSL, or copy the 30 folders from </w:t>
+        <w:t xml:space="preserve"> opens Claude's own help, use the sentence above. Windows (not tested yet): use WSL, or copy the 30 folders from </w:t>
       </w:r>
       <w:r>
         <w:rPr>
@@ -1026,7 +1026,7 @@
         <w:pStyle w:val="Heading3"/>
       </w:pPr>
       <w:r>
-        <w:t xml:space="preserve">Track 2: Claude Design (UNVERIFIED)</w:t>
+        <w:t xml:space="preserve">Track 2: Claude Design (not tested yet)</w:t>
       </w:r>
     </w:p>
     <w:p>

</xml_diff>

<commit_message>
Remove stale content, add Claude Design skills sheet, point guides at main
</commit_message>
<xml_diff>
--- a/onboarding/AIX-Lab-Atlas-Onboarding-QuickStart.docx
+++ b/onboarding/AIX-Lab-Atlas-Onboarding-QuickStart.docx
@@ -64,16 +64,7 @@
               <w:pStyle w:val="TableText"/>
             </w:pPr>
             <w:r>
-              <w:t xml:space="preserve">https://github.com/RPalis/AIXLab-Atlas (branch </w:t>
-            </w:r>
-            <w:r>
-              <w:rPr>
-                <w:rStyle w:val="CodeChar"/>
-              </w:rPr>
-              <w:t xml:space="preserve">update-readme-retire-competitors-duplicate</w:t>
-            </w:r>
-            <w:r>
-              <w:t xml:space="preserve">). No licence yet: pilot use only.</w:t>
+              <w:t xml:space="preserve">https://github.com/RPalis/AIXLab-Atlas. No licence yet: pilot use only.</w:t>
             </w:r>
           </w:p>
         </w:tc>
@@ -262,7 +253,7 @@
               <w:t xml:space="preserve">Track 2:</w:t>
             </w:r>
             <w:r>
-              <w:t xml:space="preserve"> a Claude account on a plan with Claude Design (Pro, Max, Team or Enterprise; an Enterprise admin must enable it)</w:t>
+              <w:t xml:space="preserve"> a Claude account on a plan with Claude Design (Pro, Max, Team or Enterprise; an Enterprise admin must enable it), and access to the GitHub repository</w:t>
             </w:r>
           </w:p>
         </w:tc>
@@ -591,49 +582,31 @@
               <w:t xml:space="preserve">Accept invitation</w:t>
             </w:r>
             <w:r>
-              <w:t xml:space="preserve"> &gt; branch button (says </w:t>
+              <w:t xml:space="preserve"> &gt; green </w:t>
+            </w:r>
+            <w:r>
+              <w:rPr>
+                <w:b/>
+              </w:rPr>
+              <w:t xml:space="preserve">Code</w:t>
+            </w:r>
+            <w:r>
+              <w:t xml:space="preserve"> &gt; </w:t>
+            </w:r>
+            <w:r>
+              <w:rPr>
+                <w:b/>
+              </w:rPr>
+              <w:t xml:space="preserve">Download ZIP</w:t>
+            </w:r>
+            <w:r>
+              <w:t xml:space="preserve"> &gt; unzip. Shortcut while signed in: </w:t>
             </w:r>
             <w:r>
               <w:rPr>
                 <w:rStyle w:val="CodeChar"/>
               </w:rPr>
-              <w:t xml:space="preserve">main</w:t>
-            </w:r>
-            <w:r>
-              <w:t xml:space="preserve">) &gt; choose </w:t>
-            </w:r>
-            <w:r>
-              <w:rPr>
-                <w:rStyle w:val="CodeChar"/>
-              </w:rPr>
-              <w:t xml:space="preserve">update-readme-retire-competitors-duplicate</w:t>
-            </w:r>
-            <w:r>
-              <w:t xml:space="preserve"> &gt; green </w:t>
-            </w:r>
-            <w:r>
-              <w:rPr>
-                <w:b/>
-              </w:rPr>
-              <w:t xml:space="preserve">Code</w:t>
-            </w:r>
-            <w:r>
-              <w:t xml:space="preserve"> &gt; </w:t>
-            </w:r>
-            <w:r>
-              <w:rPr>
-                <w:b/>
-              </w:rPr>
-              <w:t xml:space="preserve">Download ZIP</w:t>
-            </w:r>
-            <w:r>
-              <w:t xml:space="preserve"> &gt; unzip. Shortcut while signed in: </w:t>
-            </w:r>
-            <w:r>
-              <w:rPr>
-                <w:rStyle w:val="CodeChar"/>
-              </w:rPr>
-              <w:t xml:space="preserve">https://github.com/RPalis/AIXLab-Atlas/archive/refs/heads/update-readme-retire-competitors-duplicate.zip</w:t>
+              <w:t xml:space="preserve">https://github.com/RPalis/AIXLab-Atlas/archive/refs/heads/main.zip</w:t>
             </w:r>
             <w:r>
               <w:t xml:space="preserve">. "404" means the wrong GitHub account.</w:t>
@@ -681,15 +654,6 @@
               </w:r>
             </w:hyperlink>
             <w:r>
-              <w:t xml:space="preserve"> &gt; branch button &gt; choose </w:t>
-            </w:r>
-            <w:r>
-              <w:rPr>
-                <w:rStyle w:val="CodeChar"/>
-              </w:rPr>
-              <w:t xml:space="preserve">update-readme-retire-competitors-duplicate</w:t>
-            </w:r>
-            <w:r>
               <w:t xml:space="preserve"> &gt; green </w:t>
             </w:r>
             <w:r>
@@ -1026,7 +990,7 @@
         <w:pStyle w:val="Heading3"/>
       </w:pPr>
       <w:r>
-        <w:t xml:space="preserve">Track 2: Claude Design (not tested yet)</w:t>
+        <w:t xml:space="preserve">Track 2: Claude Design</w:t>
       </w:r>
     </w:p>
     <w:p>
@@ -1038,45 +1002,16 @@
         </w:numPr>
       </w:pPr>
       <w:r>
-        <w:t xml:space="preserve">Open </w:t>
-      </w:r>
-      <w:hyperlink r:id="rIdL7" w:history="1">
-        <w:r>
-          <w:rPr>
-            <w:rStyle w:val="Hyperlink"/>
-          </w:rPr>
-          <w:t xml:space="preserve">claude.ai/design</w:t>
-        </w:r>
-      </w:hyperlink>
-      <w:r>
-        <w:t xml:space="preserve"> and sign in (Pro, Max, Team or Enterprise; an Enterprise admin must enable it). In Settings, look for </w:t>
-      </w:r>
-      <w:r>
-        <w:rPr>
-          <w:b/>
-        </w:rPr>
-        <w:t xml:space="preserve">Skills</w:t>
-      </w:r>
-      <w:r>
-        <w:t xml:space="preserve">, </w:t>
-      </w:r>
-      <w:r>
-        <w:rPr>
-          <w:b/>
-        </w:rPr>
-        <w:t xml:space="preserve">Customize</w:t>
-      </w:r>
-      <w:r>
-        <w:t xml:space="preserve"> or </w:t>
-      </w:r>
-      <w:r>
-        <w:rPr>
-          <w:b/>
-        </w:rPr>
-        <w:t xml:space="preserve">Instructions</w:t>
-      </w:r>
-      <w:r>
-        <w:t xml:space="preserve"> and write down what you find.</w:t>
+        <w:t xml:space="preserve">In a Claude Design project send: </w:t>
+      </w:r>
+      <w:r>
+        <w:rPr>
+          <w:rStyle w:val="CodeChar"/>
+        </w:rPr>
+        <w:t xml:space="preserve">Connect the GitHub repo RPalis/AIXLab-Atlas, branch main.</w:t>
+      </w:r>
+      <w:r>
+        <w:t xml:space="preserve"> (A private repository asks you to install the GitHub App.)</w:t>
       </w:r>
     </w:p>
     <w:p>
@@ -1088,49 +1023,25 @@
         </w:numPr>
       </w:pPr>
       <w:r>
-        <w:rPr>
-          <w:b/>
-        </w:rPr>
-        <w:t xml:space="preserve">Method 1:</w:t>
-      </w:r>
-      <w:r>
-        <w:t xml:space="preserve"> upload </w:t>
-      </w:r>
-      <w:r>
-        <w:rPr>
-          <w:rStyle w:val="CodeChar"/>
-        </w:rPr>
-        <w:t xml:space="preserve">help.zip</w:t>
-      </w:r>
-      <w:r>
-        <w:t xml:space="preserve"> from </w:t>
-      </w:r>
-      <w:r>
-        <w:rPr>
-          <w:rStyle w:val="CodeChar"/>
-        </w:rPr>
-        <w:t xml:space="preserve">onboarding/starter-skill-zips</w:t>
-      </w:r>
-      <w:r>
-        <w:t xml:space="preserve"> in the unzipped files. </w:t>
-      </w:r>
-      <w:r>
-        <w:rPr>
-          <w:b/>
-        </w:rPr>
-        <w:t xml:space="preserve">Method 2, if that is not possible:</w:t>
-      </w:r>
-      <w:r>
-        <w:t xml:space="preserve"> paste the whole text of </w:t>
-      </w:r>
-      <w:r>
-        <w:rPr>
-          <w:rStyle w:val="CodeChar"/>
-        </w:rPr>
-        <w:t xml:space="preserve">skills/help/SKILL.md</w:t>
-      </w:r>
-      <w:r>
-        <w:t xml:space="preserve"> into a new chat and add: Follow these instructions for this session.</w:t>
+        <w:t xml:space="preserve">Send: </w:t>
+      </w:r>
+      <w:r>
+        <w:rPr>
+          <w:rStyle w:val="CodeChar"/>
+        </w:rPr>
+        <w:t xml:space="preserve">Copy the whole skills/ folder from RPalis/AIXLab-Atlas into this project, keeping the folder structure.</w:t>
+      </w:r>
+      <w:r>
+        <w:t xml:space="preserve"> If the project already has a </w:t>
+      </w:r>
+      <w:r>
+        <w:rPr>
+          <w:rStyle w:val="CodeChar"/>
+        </w:rPr>
+        <w:t xml:space="preserve">skills/</w:t>
+      </w:r>
+      <w:r>
+        <w:t xml:space="preserve"> folder, delete it first so no old copy remains.</w:t>
       </w:r>
     </w:p>
     <w:p>
@@ -1142,13 +1053,37 @@
         </w:numPr>
       </w:pPr>
       <w:r>
-        <w:t xml:space="preserve">Type: </w:t>
-      </w:r>
-      <w:r>
-        <w:rPr>
-          <w:rStyle w:val="CodeChar"/>
-        </w:rPr>
-        <w:t xml:space="preserve">I am starting a new product idea and have no files yet. Which skill should I run first?</w:t>
+        <w:t xml:space="preserve">Send: </w:t>
+      </w:r>
+      <w:r>
+        <w:rPr>
+          <w:rStyle w:val="CodeChar"/>
+        </w:rPr>
+        <w:t xml:space="preserve">Create CLAUDE.md at the project root with exactly this text</w:t>
+      </w:r>
+      <w:r>
+        <w:t xml:space="preserve">, then paste the command rule from step 3 of the Claude Design skills sheet. Repeat in every new project.</w:t>
+      </w:r>
+    </w:p>
+    <w:p>
+      <w:pPr>
+        <w:pStyle w:val="ListParagraph"/>
+        <w:numPr>
+          <w:ilvl w:val="0"/>
+          <w:numId w:val="4"/>
+        </w:numPr>
+      </w:pPr>
+      <w:r>
+        <w:t xml:space="preserve">Send: </w:t>
+      </w:r>
+      <w:r>
+        <w:rPr>
+          <w:rStyle w:val="CodeChar"/>
+        </w:rPr>
+        <w:t xml:space="preserve">/help atlas</w:t>
+      </w:r>
+      <w:r>
+        <w:t xml:space="preserve">.</w:t>
       </w:r>
     </w:p>
     <w:p>
@@ -1162,7 +1097,31 @@
         <w:t xml:space="preserve">Check: </w:t>
       </w:r>
       <w:r>
-        <w:t xml:space="preserve">Claude names a skill and says why. Claude Design may have no file system, so skills that write project files return their output in the conversation, and build skills (</w:t>
+        <w:rPr>
+          <w:rStyle w:val="CodeChar"/>
+        </w:rPr>
+        <w:t xml:space="preserve">skills/help/SKILL.md</w:t>
+      </w:r>
+      <w:r>
+        <w:t xml:space="preserve"> exists and </w:t>
+      </w:r>
+      <w:r>
+        <w:rPr>
+          <w:rStyle w:val="CodeChar"/>
+        </w:rPr>
+        <w:t xml:space="preserve">/help atlas</w:t>
+      </w:r>
+      <w:r>
+        <w:t xml:space="preserve"> lists the skills. Typing </w:t>
+      </w:r>
+      <w:r>
+        <w:rPr>
+          <w:rStyle w:val="CodeChar"/>
+        </w:rPr>
+        <w:t xml:space="preserve">/</w:t>
+      </w:r>
+      <w:r>
+        <w:t xml:space="preserve"> shows no list in Claude Design: that is expected, the rule file makes the commands work. Skills that need a shell (</w:t>
       </w:r>
       <w:r>
         <w:rPr>
@@ -1180,7 +1139,7 @@
         <w:t xml:space="preserve">package</w:t>
       </w:r>
       <w:r>
-        <w:t xml:space="preserve">) need Claude Code. Tell the observer which method worked.</w:t>
+        <w:t xml:space="preserve">) need Claude Code.</w:t>
       </w:r>
     </w:p>
     <w:p>
@@ -1215,34 +1174,16 @@
         <w:t xml:space="preserve">Use the setup skill. Project: &lt;your invented idea&gt;. Starting point: brand-new idea.</w:t>
       </w:r>
       <w:r>
-        <w:t xml:space="preserve"> Track 2: load </w:t>
-      </w:r>
-      <w:r>
-        <w:rPr>
-          <w:rStyle w:val="CodeChar"/>
-        </w:rPr>
-        <w:t xml:space="preserve">brief</w:t>
-      </w:r>
-      <w:r>
-        <w:t xml:space="preserve"> (upload </w:t>
-      </w:r>
-      <w:r>
-        <w:rPr>
-          <w:rStyle w:val="CodeChar"/>
-        </w:rPr>
-        <w:t xml:space="preserve">brief.zip</w:t>
-      </w:r>
-      <w:r>
-        <w:t xml:space="preserve"> or paste its </w:t>
-      </w:r>
-      <w:r>
-        <w:rPr>
-          <w:rStyle w:val="CodeChar"/>
-        </w:rPr>
-        <w:t xml:space="preserve">SKILL.md</w:t>
-      </w:r>
-      <w:r>
-        <w:t xml:space="preserve">) and run it instead. Read the plan. If it names anything outside </w:t>
+        <w:t xml:space="preserve"> Track 2: send </w:t>
+      </w:r>
+      <w:r>
+        <w:rPr>
+          <w:rStyle w:val="CodeChar"/>
+        </w:rPr>
+        <w:t xml:space="preserve">/brief &lt;your idea&gt;</w:t>
+      </w:r>
+      <w:r>
+        <w:t xml:space="preserve"> the same way. Read the plan. If it names anything outside </w:t>
       </w:r>
       <w:r>
         <w:rPr>
@@ -1395,16 +1336,16 @@
         <w:t xml:space="preserve">spec</w:t>
       </w:r>
       <w:r>
-        <w:t xml:space="preserve">. Track 2: make one screen in Claude Design, then run </w:t>
-      </w:r>
-      <w:r>
-        <w:rPr>
-          <w:rStyle w:val="CodeChar"/>
-        </w:rPr>
-        <w:t xml:space="preserve">audit</w:t>
-      </w:r>
-      <w:r>
-        <w:t xml:space="preserve"> on it. Mark each finding </w:t>
+        <w:t xml:space="preserve">. Track 2: make one screen in Claude Design, then send </w:t>
+      </w:r>
+      <w:r>
+        <w:rPr>
+          <w:rStyle w:val="CodeChar"/>
+        </w:rPr>
+        <w:t xml:space="preserve">/audit craft</w:t>
+      </w:r>
+      <w:r>
+        <w:t xml:space="preserve">. Mark each finding </w:t>
       </w:r>
       <w:r>
         <w:rPr>
@@ -2035,7 +1976,7 @@
               <w:pStyle w:val="TableText"/>
             </w:pPr>
             <w:r>
-              <w:t xml:space="preserve">GitHub shows 404, or Claude Design ignores a skill</w:t>
+              <w:t xml:space="preserve">GitHub shows 404, or a Claude Design command does nothing</w:t>
             </w:r>
           </w:p>
         </w:tc>
@@ -2048,16 +1989,16 @@
               <w:pStyle w:val="TableText"/>
             </w:pPr>
             <w:r>
-              <w:t xml:space="preserve">Switch to the invited account. Or paste the skill's </w:t>
+              <w:t xml:space="preserve">Switch to the invited account. Or check step 3 was done in this project and </w:t>
             </w:r>
             <w:r>
               <w:rPr>
                 <w:rStyle w:val="CodeChar"/>
               </w:rPr>
-              <w:t xml:space="preserve">SKILL.md</w:t>
-            </w:r>
-            <w:r>
-              <w:t xml:space="preserve"> into the chat.</w:t>
+              <w:t xml:space="preserve">skills/&lt;name&gt;/SKILL.md</w:t>
+            </w:r>
+            <w:r>
+              <w:t xml:space="preserve"> exists.</w:t>
             </w:r>
           </w:p>
         </w:tc>
@@ -2092,7 +2033,7 @@
       <w:r>
         <w:t xml:space="preserve"> repository </w:t>
       </w:r>
-      <w:hyperlink r:id="rIdL8" w:history="1">
+      <w:hyperlink r:id="rIdL7" w:history="1">
         <w:r>
           <w:rPr>
             <w:rStyle w:val="Hyperlink"/>
@@ -2103,7 +2044,7 @@
       <w:r>
         <w:t xml:space="preserve"> · </w:t>
       </w:r>
-      <w:hyperlink r:id="rIdL9" w:history="1">
+      <w:hyperlink r:id="rIdL8" w:history="1">
         <w:r>
           <w:rPr>
             <w:rStyle w:val="Hyperlink"/>
@@ -2114,7 +2055,7 @@
       <w:r>
         <w:t xml:space="preserve"> · </w:t>
       </w:r>
-      <w:hyperlink r:id="rIdL10" w:history="1">
+      <w:hyperlink r:id="rIdL9" w:history="1">
         <w:r>
           <w:rPr>
             <w:rStyle w:val="Hyperlink"/>
@@ -2125,7 +2066,7 @@
       <w:r>
         <w:t xml:space="preserve"> · </w:t>
       </w:r>
-      <w:hyperlink r:id="rIdL11" w:history="1">
+      <w:hyperlink r:id="rIdL10" w:history="1">
         <w:r>
           <w:rPr>
             <w:rStyle w:val="Hyperlink"/>
@@ -2136,7 +2077,7 @@
       <w:r>
         <w:t xml:space="preserve"> · </w:t>
       </w:r>
-      <w:hyperlink r:id="rIdL12" w:history="1">
+      <w:hyperlink r:id="rIdL11" w:history="1">
         <w:r>
           <w:rPr>
             <w:rStyle w:val="Hyperlink"/>
@@ -2145,7 +2086,7 @@
         </w:r>
       </w:hyperlink>
       <w:r>
-        <w:t xml:space="preserve">. Full guides: Track 1 (Claude Code) and Track 2 (Claude Design).</w:t>
+        <w:t xml:space="preserve">. Full guides: Claude Code setup, and the skills sheets for Claude Code and Claude Design.</w:t>
       </w:r>
     </w:p>
     <w:sectPr>

</xml_diff>

<commit_message>
Finalise designer onboarding files
</commit_message>
<xml_diff>
--- a/onboarding/AIX-Lab-Atlas-Onboarding-QuickStart.docx
+++ b/onboarding/AIX-Lab-Atlas-Onboarding-QuickStart.docx
@@ -64,7 +64,7 @@
               <w:pStyle w:val="TableText"/>
             </w:pPr>
             <w:r>
-              <w:t xml:space="preserve">https://github.com/RPalis/AIXLab-Atlas. No licence yet: pilot use only.</w:t>
+              <w:t xml:space="preserve">https://github.com/RPalis/AIXLab-Atlas. Internal use. Do not share outside the team.</w:t>
             </w:r>
           </w:p>
         </w:tc>
@@ -200,7 +200,7 @@
               <w:t xml:space="preserve">Track 1:</w:t>
             </w:r>
             <w:r>
-              <w:t xml:space="preserve"> Claude desktop app and a paid Claude plan (or a Console account). Windows also needs Git for Windows or WSL (not tested yet)</w:t>
+              <w:t xml:space="preserve"> Claude desktop app and a paid Claude plan (or a Console account).</w:t>
             </w:r>
           </w:p>
         </w:tc>
@@ -964,25 +964,7 @@
         <w:t xml:space="preserve">/help</w:t>
       </w:r>
       <w:r>
-        <w:t xml:space="preserve"> opens Claude's own help, use the sentence above. Windows (not tested yet): use WSL, or copy the 30 folders from </w:t>
-      </w:r>
-      <w:r>
-        <w:rPr>
-          <w:rStyle w:val="CodeChar"/>
-        </w:rPr>
-        <w:t xml:space="preserve">skills</w:t>
-      </w:r>
-      <w:r>
-        <w:t xml:space="preserve"> into </w:t>
-      </w:r>
-      <w:r>
-        <w:rPr>
-          <w:rStyle w:val="CodeChar"/>
-        </w:rPr>
-        <w:t xml:space="preserve">C:\Users\&lt;you&gt;\.claude\skills</w:t>
-      </w:r>
-      <w:r>
-        <w:t xml:space="preserve">.</w:t>
+        <w:t xml:space="preserve"> opens Claude's own help, use the sentence above. On Windows, ask the team for the install steps.</w:t>
       </w:r>
     </w:p>
     <w:p>

</xml_diff>

<commit_message>
Merge Claude Code guides into one, no terminal
</commit_message>
<xml_diff>
--- a/onboarding/AIX-Lab-Atlas-Onboarding-QuickStart.docx
+++ b/onboarding/AIX-Lab-Atlas-Onboarding-QuickStart.docx
@@ -200,7 +200,7 @@
               <w:t xml:space="preserve">Track 1:</w:t>
             </w:r>
             <w:r>
-              <w:t xml:space="preserve"> Claude desktop app and a paid Claude plan (or a Console account).</w:t>
+              <w:t xml:space="preserve"> Claude desktop app and a paid Claude plan (or a Console account); no terminal needed.</w:t>
             </w:r>
           </w:p>
         </w:tc>
@@ -746,7 +746,7 @@
         <w:t xml:space="preserve">skills</w:t>
       </w:r>
       <w:r>
-        <w:t xml:space="preserve">, </w:t>
+        <w:t xml:space="preserve"> and </w:t>
       </w:r>
       <w:r>
         <w:rPr>
@@ -755,15 +755,6 @@
         <w:t xml:space="preserve">README.md</w:t>
       </w:r>
       <w:r>
-        <w:t xml:space="preserve"> and </w:t>
-      </w:r>
-      <w:r>
-        <w:rPr>
-          <w:rStyle w:val="CodeChar"/>
-        </w:rPr>
-        <w:t xml:space="preserve">install.sh</w:t>
-      </w:r>
-      <w:r>
         <w:t xml:space="preserve">.</w:t>
       </w:r>
     </w:p>
@@ -780,7 +771,7 @@
         <w:pStyle w:val="Heading3"/>
       </w:pPr>
       <w:r>
-        <w:t xml:space="preserve">Track 1: Claude Code (checked on macOS)</w:t>
+        <w:t xml:space="preserve">Track 1: Claude Code (desktop app, no terminal)</w:t>
       </w:r>
     </w:p>
     <w:p>
@@ -803,7 +794,7 @@
         </w:r>
       </w:hyperlink>
       <w:r>
-        <w:t xml:space="preserve">, sign in, and open the </w:t>
+        <w:t xml:space="preserve">, sign in, open the </w:t>
       </w:r>
       <w:r>
         <w:rPr>
@@ -812,7 +803,7 @@
         <w:t xml:space="preserve">Code</w:t>
       </w:r>
       <w:r>
-        <w:t xml:space="preserve"> tab.</w:t>
+        <w:t xml:space="preserve"> tab once, then quit the app.</w:t>
       </w:r>
     </w:p>
     <w:p>
@@ -824,43 +815,52 @@
         </w:numPr>
       </w:pPr>
       <w:r>
-        <w:t xml:space="preserve">Open </w:t>
+        <w:t xml:space="preserve">In Finder press </w:t>
       </w:r>
       <w:r>
         <w:rPr>
           <w:b/>
         </w:rPr>
-        <w:t xml:space="preserve">Terminal</w:t>
-      </w:r>
-      <w:r>
-        <w:t xml:space="preserve"> (Cmd+Space, type Terminal). Type </w:t>
-      </w:r>
-      <w:r>
-        <w:rPr>
-          <w:rStyle w:val="CodeChar"/>
-        </w:rPr>
-        <w:t xml:space="preserve">cd </w:t>
-      </w:r>
-      <w:r>
-        <w:t xml:space="preserve"> plus a space, drag the unzipped folder onto the window, press Enter. Run </w:t>
-      </w:r>
-      <w:r>
-        <w:rPr>
-          <w:rStyle w:val="CodeChar"/>
-        </w:rPr>
-        <w:t xml:space="preserve">./install.sh --claude --no-open</w:t>
-      </w:r>
-      <w:r>
-        <w:t xml:space="preserve"> (if "permission denied", run </w:t>
-      </w:r>
-      <w:r>
-        <w:rPr>
-          <w:rStyle w:val="CodeChar"/>
-        </w:rPr>
-        <w:t xml:space="preserve">chmod +x install.sh</w:t>
-      </w:r>
-      <w:r>
-        <w:t xml:space="preserve"> first).</w:t>
+        <w:t xml:space="preserve">Cmd+Shift+G</w:t>
+      </w:r>
+      <w:r>
+        <w:t xml:space="preserve">, type </w:t>
+      </w:r>
+      <w:r>
+        <w:rPr>
+          <w:rStyle w:val="CodeChar"/>
+        </w:rPr>
+        <w:t xml:space="preserve">~/.claude</w:t>
+      </w:r>
+      <w:r>
+        <w:t xml:space="preserve">, press Enter, and open (or create) a folder named </w:t>
+      </w:r>
+      <w:r>
+        <w:rPr>
+          <w:rStyle w:val="CodeChar"/>
+        </w:rPr>
+        <w:t xml:space="preserve">skills</w:t>
+      </w:r>
+      <w:r>
+        <w:t xml:space="preserve">. Copy all 30 folders from the unzipped </w:t>
+      </w:r>
+      <w:r>
+        <w:rPr>
+          <w:rStyle w:val="CodeChar"/>
+        </w:rPr>
+        <w:t xml:space="preserve">skills</w:t>
+      </w:r>
+      <w:r>
+        <w:t xml:space="preserve"> folder into it. If Finder asks, choose </w:t>
+      </w:r>
+      <w:r>
+        <w:rPr>
+          <w:b/>
+        </w:rPr>
+        <w:t xml:space="preserve">Replace</w:t>
+      </w:r>
+      <w:r>
+        <w:t xml:space="preserve">.</w:t>
       </w:r>
     </w:p>
     <w:p>
@@ -872,7 +872,16 @@
         </w:numPr>
       </w:pPr>
       <w:r>
-        <w:t xml:space="preserve">In the Code tab choose </w:t>
+        <w:t xml:space="preserve">Reopen the app, open the </w:t>
+      </w:r>
+      <w:r>
+        <w:rPr>
+          <w:b/>
+        </w:rPr>
+        <w:t xml:space="preserve">Code</w:t>
+      </w:r>
+      <w:r>
+        <w:t xml:space="preserve"> tab, and choose </w:t>
       </w:r>
       <w:r>
         <w:rPr>
@@ -881,7 +890,7 @@
         <w:t xml:space="preserve">atlas-practice</w:t>
       </w:r>
       <w:r>
-        <w:t xml:space="preserve"> as the working folder. Turn on plan mode (Shift+Tab, or the mode selector). Type: </w:t>
+        <w:t xml:space="preserve"> as the working folder. Turn on plan mode (the mode selector, or Shift+Tab). Type: </w:t>
       </w:r>
       <w:r>
         <w:rPr>
@@ -901,7 +910,7 @@
         <w:t xml:space="preserve">Check: </w:t>
       </w:r>
       <w:r>
-        <w:t xml:space="preserve">The installer ends with "Successfully installed 30 skills!". Typing </w:t>
+        <w:t xml:space="preserve">Typing </w:t>
       </w:r>
       <w:r>
         <w:rPr>
@@ -937,7 +946,7 @@
         <w:t xml:space="preserve">persona</w:t>
       </w:r>
       <w:r>
-        <w:t xml:space="preserve">, </w:t>
+        <w:t xml:space="preserve"> and </w:t>
       </w:r>
       <w:r>
         <w:rPr>
@@ -946,7 +955,7 @@
         <w:t xml:space="preserve">audit</w:t>
       </w:r>
       <w:r>
-        <w:t xml:space="preserve">. Claude names </w:t>
+        <w:t xml:space="preserve">, and Claude names </w:t>
       </w:r>
       <w:r>
         <w:rPr>
@@ -2068,7 +2077,7 @@
         </w:r>
       </w:hyperlink>
       <w:r>
-        <w:t xml:space="preserve">. Full guides: Claude Code setup, and the skills sheets for Claude Code and Claude Design.</w:t>
+        <w:t xml:space="preserve">. Full guides: the Claude Code guide and the Claude Design sheet.</w:t>
       </w:r>
     </w:p>
     <w:sectPr>

</xml_diff>

<commit_message>
Onboarding v2: design-system how-tos for Claude Code and Claude Design
</commit_message>
<xml_diff>
--- a/onboarding/AIX-Lab-Atlas-Onboarding-QuickStart.docx
+++ b/onboarding/AIX-Lab-Atlas-Onboarding-QuickStart.docx
@@ -38,6 +38,37 @@
         <w:gridCol w:w="2131"/>
         <w:gridCol w:w="8525"/>
       </w:tblGrid>
+      <w:tr>
+        <w:trPr>
+          <w:cantSplit/>
+        </w:trPr>
+        <w:tc>
+          <w:tcPr>
+            <w:tcW w:w="2131" w:type="dxa"/>
+          </w:tcPr>
+          <w:p>
+            <w:pPr>
+              <w:pStyle w:val="TableText"/>
+            </w:pPr>
+            <w:r>
+              <w:t xml:space="preserve">Version</w:t>
+            </w:r>
+          </w:p>
+        </w:tc>
+        <w:tc>
+          <w:tcPr>
+            <w:tcW w:w="8525" w:type="dxa"/>
+          </w:tcPr>
+          <w:p>
+            <w:pPr>
+              <w:pStyle w:val="TableText"/>
+            </w:pPr>
+            <w:r>
+              <w:t xml:space="preserve">2</w:t>
+            </w:r>
+          </w:p>
+        </w:tc>
+      </w:tr>
       <w:tr>
         <w:trPr>
           <w:cantSplit/>
@@ -1398,7 +1429,7 @@
         <w:pStyle w:val="Heading1"/>
       </w:pPr>
       <w:r>
-        <w:t xml:space="preserve">6. Do you have a design system? (Track 1; advice, never a blocker)</w:t>
+        <w:t xml:space="preserve">6. Design system how-tos (advice, never a blocker)</w:t>
       </w:r>
     </w:p>
     <w:tbl>
@@ -1418,9 +1449,9 @@
         </w:tblCellMar>
       </w:tblPr>
       <w:tblGrid>
-        <w:gridCol w:w="2771"/>
-        <w:gridCol w:w="4689"/>
-        <w:gridCol w:w="3196"/>
+        <w:gridCol w:w="2131"/>
+        <w:gridCol w:w="4262"/>
+        <w:gridCol w:w="4263"/>
       </w:tblGrid>
       <w:tr>
         <w:trPr>
@@ -1429,7 +1460,7 @@
         </w:trPr>
         <w:tc>
           <w:tcPr>
-            <w:tcW w:w="2771" w:type="dxa"/>
+            <w:tcW w:w="2131" w:type="dxa"/>
             <w:shd w:val="clear" w:color="auto" w:fill="0B4F66"/>
           </w:tcPr>
           <w:p>
@@ -1447,7 +1478,7 @@
         </w:tc>
         <w:tc>
           <w:tcPr>
-            <w:tcW w:w="4689" w:type="dxa"/>
+            <w:tcW w:w="4262" w:type="dxa"/>
             <w:shd w:val="clear" w:color="auto" w:fill="0B4F66"/>
           </w:tcPr>
           <w:p>
@@ -1459,13 +1490,13 @@
                 <w:b/>
                 <w:color w:val="FFFFFF"/>
               </w:rPr>
-              <w:t xml:space="preserve">Run</w:t>
-            </w:r>
-          </w:p>
-        </w:tc>
-        <w:tc>
-          <w:tcPr>
-            <w:tcW w:w="3196" w:type="dxa"/>
+              <w:t xml:space="preserve">Claude Code</w:t>
+            </w:r>
+          </w:p>
+        </w:tc>
+        <w:tc>
+          <w:tcPr>
+            <w:tcW w:w="4263" w:type="dxa"/>
             <w:shd w:val="clear" w:color="auto" w:fill="0B4F66"/>
           </w:tcPr>
           <w:p>
@@ -1477,7 +1508,7 @@
                 <w:b/>
                 <w:color w:val="FFFFFF"/>
               </w:rPr>
-              <w:t xml:space="preserve">Result</w:t>
+              <w:t xml:space="preserve">Claude Design</w:t>
             </w:r>
           </w:p>
         </w:tc>
@@ -1488,58 +1519,85 @@
         </w:trPr>
         <w:tc>
           <w:tcPr>
-            <w:tcW w:w="2771" w:type="dxa"/>
-          </w:tcPr>
-          <w:p>
-            <w:pPr>
-              <w:pStyle w:val="TableText"/>
-            </w:pPr>
-            <w:r>
-              <w:rPr>
-                <w:b/>
-              </w:rPr>
-              <w:t xml:space="preserve">A.</w:t>
-            </w:r>
-            <w:r>
-              <w:t xml:space="preserve"> Tokens already in code</w:t>
-            </w:r>
-          </w:p>
-        </w:tc>
-        <w:tc>
-          <w:tcPr>
-            <w:tcW w:w="4689" w:type="dxa"/>
-          </w:tcPr>
-          <w:p>
-            <w:pPr>
-              <w:pStyle w:val="TableText"/>
-            </w:pPr>
+            <w:tcW w:w="2131" w:type="dxa"/>
+          </w:tcPr>
+          <w:p>
+            <w:pPr>
+              <w:pStyle w:val="TableText"/>
+            </w:pPr>
+            <w:r>
+              <w:rPr>
+                <w:b/>
+              </w:rPr>
+              <w:t xml:space="preserve">1. Connect from Git</w:t>
+            </w:r>
+          </w:p>
+        </w:tc>
+        <w:tc>
+          <w:tcPr>
+            <w:tcW w:w="4262" w:type="dxa"/>
+          </w:tcPr>
+          <w:p>
+            <w:pPr>
+              <w:pStyle w:val="TableText"/>
+            </w:pPr>
+            <w:r>
+              <w:t xml:space="preserve">React library: </w:t>
+            </w:r>
             <w:r>
               <w:rPr>
                 <w:rStyle w:val="CodeChar"/>
               </w:rPr>
-              <w:t xml:space="preserve">styleguide</w:t>
-            </w:r>
-            <w:r>
-              <w:t xml:space="preserve">, audit what exists</w:t>
-            </w:r>
-          </w:p>
-        </w:tc>
-        <w:tc>
-          <w:tcPr>
-            <w:tcW w:w="3196" w:type="dxa"/>
-          </w:tcPr>
-          <w:p>
-            <w:pPr>
-              <w:pStyle w:val="TableText"/>
-            </w:pPr>
+              <w:t xml:space="preserve">/design-sync</w:t>
+            </w:r>
+            <w:r>
+              <w:t xml:space="preserve">. Any code: </w:t>
+            </w:r>
             <w:r>
               <w:rPr>
                 <w:rStyle w:val="CodeChar"/>
               </w:rPr>
-              <w:t xml:space="preserve">DESIGN.md</w:t>
-            </w:r>
-            <w:r>
-              <w:t xml:space="preserve"> from your real tokens</w:t>
+              <w:t xml:space="preserve">/styleguide</w:t>
+            </w:r>
+            <w:r>
+              <w:t xml:space="preserve">, then "audit and document the tokens, change nothing".</w:t>
+            </w:r>
+          </w:p>
+        </w:tc>
+        <w:tc>
+          <w:tcPr>
+            <w:tcW w:w="4263" w:type="dxa"/>
+          </w:tcPr>
+          <w:p>
+            <w:pPr>
+              <w:pStyle w:val="TableText"/>
+            </w:pPr>
+            <w:r>
+              <w:rPr>
+                <w:b/>
+              </w:rPr>
+              <w:t xml:space="preserve">Settings &gt; Design systems</w:t>
+            </w:r>
+            <w:r>
+              <w:t xml:space="preserve"> &gt; new &gt; the GitHub repository. Then </w:t>
+            </w:r>
+            <w:r>
+              <w:rPr>
+                <w:b/>
+              </w:rPr>
+              <w:t xml:space="preserve">Open &gt; Remix</w:t>
+            </w:r>
+            <w:r>
+              <w:t xml:space="preserve"> to review, test, </w:t>
+            </w:r>
+            <w:r>
+              <w:rPr>
+                <w:b/>
+              </w:rPr>
+              <w:t xml:space="preserve">Published</w:t>
+            </w:r>
+            <w:r>
+              <w:t xml:space="preserve">.</w:t>
             </w:r>
           </w:p>
         </w:tc>
@@ -1550,26 +1608,23 @@
         </w:trPr>
         <w:tc>
           <w:tcPr>
-            <w:tcW w:w="2771" w:type="dxa"/>
-          </w:tcPr>
-          <w:p>
-            <w:pPr>
-              <w:pStyle w:val="TableText"/>
-            </w:pPr>
-            <w:r>
-              <w:rPr>
-                <w:b/>
-              </w:rPr>
-              <w:t xml:space="preserve">B.</w:t>
-            </w:r>
-            <w:r>
-              <w:t xml:space="preserve"> A brand, no system</w:t>
-            </w:r>
-          </w:p>
-        </w:tc>
-        <w:tc>
-          <w:tcPr>
-            <w:tcW w:w="4689" w:type="dxa"/>
+            <w:tcW w:w="2131" w:type="dxa"/>
+          </w:tcPr>
+          <w:p>
+            <w:pPr>
+              <w:pStyle w:val="TableText"/>
+            </w:pPr>
+            <w:r>
+              <w:rPr>
+                <w:b/>
+              </w:rPr>
+              <w:t xml:space="preserve">2. Create, foundations only</w:t>
+            </w:r>
+          </w:p>
+        </w:tc>
+        <w:tc>
+          <w:tcPr>
+            <w:tcW w:w="4262" w:type="dxa"/>
           </w:tcPr>
           <w:p>
             <w:pPr>
@@ -1579,32 +1634,50 @@
               <w:rPr>
                 <w:rStyle w:val="CodeChar"/>
               </w:rPr>
-              <w:t xml:space="preserve">styleguide</w:t>
-            </w:r>
-            <w:r>
-              <w:t xml:space="preserve"> in </w:t>
+              <w:t xml:space="preserve">/styleguide</w:t>
+            </w:r>
+            <w:r>
+              <w:t xml:space="preserve"> (placeholder) or </w:t>
             </w:r>
             <w:r>
               <w:rPr>
                 <w:rStyle w:val="CodeChar"/>
               </w:rPr>
-              <w:t xml:space="preserve">forge</w:t>
-            </w:r>
-            <w:r>
-              <w:t xml:space="preserve"> mode, with sources</w:t>
-            </w:r>
-          </w:p>
-        </w:tc>
-        <w:tc>
-          <w:tcPr>
-            <w:tcW w:w="3196" w:type="dxa"/>
-          </w:tcPr>
-          <w:p>
-            <w:pPr>
-              <w:pStyle w:val="TableText"/>
-            </w:pPr>
-            <w:r>
-              <w:t xml:space="preserve">Tokens traced to sources</w:t>
+              <w:t xml:space="preserve">/styleguide forge</w:t>
+            </w:r>
+            <w:r>
+              <w:t xml:space="preserve"> (real brand): "foundations only, no components".</w:t>
+            </w:r>
+          </w:p>
+        </w:tc>
+        <w:tc>
+          <w:tcPr>
+            <w:tcW w:w="4263" w:type="dxa"/>
+          </w:tcPr>
+          <w:p>
+            <w:pPr>
+              <w:pStyle w:val="TableText"/>
+            </w:pPr>
+            <w:r>
+              <w:t xml:space="preserve">Upload logo, colour file and type spec to a new design system and say "foundations only". Review in </w:t>
+            </w:r>
+            <w:r>
+              <w:rPr>
+                <w:b/>
+              </w:rPr>
+              <w:t xml:space="preserve">Remix</w:t>
+            </w:r>
+            <w:r>
+              <w:t xml:space="preserve">, </w:t>
+            </w:r>
+            <w:r>
+              <w:rPr>
+                <w:b/>
+              </w:rPr>
+              <w:t xml:space="preserve">Published</w:t>
+            </w:r>
+            <w:r>
+              <w:t xml:space="preserve">.</w:t>
             </w:r>
           </w:p>
         </w:tc>
@@ -1615,126 +1688,67 @@
         </w:trPr>
         <w:tc>
           <w:tcPr>
-            <w:tcW w:w="2771" w:type="dxa"/>
-          </w:tcPr>
-          <w:p>
-            <w:pPr>
-              <w:pStyle w:val="TableText"/>
-            </w:pPr>
-            <w:r>
-              <w:rPr>
-                <w:b/>
-              </w:rPr>
-              <w:t xml:space="preserve">C.</w:t>
-            </w:r>
-            <w:r>
-              <w:t xml:space="preserve"> A Figma library only</w:t>
-            </w:r>
-          </w:p>
-        </w:tc>
-        <w:tc>
-          <w:tcPr>
-            <w:tcW w:w="4689" w:type="dxa"/>
-          </w:tcPr>
-          <w:p>
-            <w:pPr>
-              <w:pStyle w:val="TableText"/>
-            </w:pPr>
-            <w:r>
-              <w:t xml:space="preserve">Figma MCP server, then </w:t>
-            </w:r>
+            <w:tcW w:w="2131" w:type="dxa"/>
+          </w:tcPr>
+          <w:p>
+            <w:pPr>
+              <w:pStyle w:val="TableText"/>
+            </w:pPr>
+            <w:r>
+              <w:rPr>
+                <w:b/>
+              </w:rPr>
+              <w:t xml:space="preserve">3. From Figma</w:t>
+            </w:r>
+          </w:p>
+        </w:tc>
+        <w:tc>
+          <w:tcPr>
+            <w:tcW w:w="4262" w:type="dxa"/>
+          </w:tcPr>
+          <w:p>
+            <w:pPr>
+              <w:pStyle w:val="TableText"/>
+            </w:pPr>
             <w:r>
               <w:rPr>
                 <w:rStyle w:val="CodeChar"/>
               </w:rPr>
-              <w:t xml:space="preserve">figma</w:t>
-            </w:r>
-            <w:r>
-              <w:t xml:space="preserve"> </w:t>
+              <w:t xml:space="preserve">/figma</w:t>
+            </w:r>
+            <w:r>
+              <w:t xml:space="preserve"> import, with the Figma connector set up once by the team.</w:t>
+            </w:r>
+          </w:p>
+        </w:tc>
+        <w:tc>
+          <w:tcPr>
+            <w:tcW w:w="4263" w:type="dxa"/>
+          </w:tcPr>
+          <w:p>
+            <w:pPr>
+              <w:pStyle w:val="TableText"/>
+            </w:pPr>
+            <w:r>
+              <w:t xml:space="preserve">Figma </w:t>
+            </w:r>
+            <w:r>
+              <w:rPr>
+                <w:b/>
+              </w:rPr>
+              <w:t xml:space="preserve">File &gt; Save local copy</w:t>
+            </w:r>
+            <w:r>
+              <w:t xml:space="preserve">, upload the </w:t>
             </w:r>
             <w:r>
               <w:rPr>
                 <w:rStyle w:val="CodeChar"/>
               </w:rPr>
-              <w:t xml:space="preserve">import</w:t>
-            </w:r>
-            <w:r>
-              <w:t xml:space="preserve"> and </w:t>
-            </w:r>
-            <w:r>
-              <w:rPr>
-                <w:rStyle w:val="CodeChar"/>
-              </w:rPr>
-              <w:t xml:space="preserve">sync</w:t>
-            </w:r>
-          </w:p>
-        </w:tc>
-        <w:tc>
-          <w:tcPr>
-            <w:tcW w:w="3196" w:type="dxa"/>
-          </w:tcPr>
-          <w:p>
-            <w:pPr>
-              <w:pStyle w:val="TableText"/>
-            </w:pPr>
-            <w:r>
-              <w:t xml:space="preserve">Code that follows the library</w:t>
-            </w:r>
-          </w:p>
-        </w:tc>
-      </w:tr>
-      <w:tr>
-        <w:trPr>
-          <w:cantSplit/>
-        </w:trPr>
-        <w:tc>
-          <w:tcPr>
-            <w:tcW w:w="2771" w:type="dxa"/>
-          </w:tcPr>
-          <w:p>
-            <w:pPr>
-              <w:pStyle w:val="TableText"/>
-            </w:pPr>
-            <w:r>
-              <w:rPr>
-                <w:b/>
-              </w:rPr>
-              <w:t xml:space="preserve">D.</w:t>
-            </w:r>
-            <w:r>
-              <w:t xml:space="preserve"> Nothing yet</w:t>
-            </w:r>
-          </w:p>
-        </w:tc>
-        <w:tc>
-          <w:tcPr>
-            <w:tcW w:w="4689" w:type="dxa"/>
-          </w:tcPr>
-          <w:p>
-            <w:pPr>
-              <w:pStyle w:val="TableText"/>
-            </w:pPr>
-            <w:r>
-              <w:rPr>
-                <w:rStyle w:val="CodeChar"/>
-              </w:rPr>
-              <w:t xml:space="preserve">styleguide</w:t>
-            </w:r>
-            <w:r>
-              <w:t xml:space="preserve">, default mode</w:t>
-            </w:r>
-          </w:p>
-        </w:tc>
-        <w:tc>
-          <w:tcPr>
-            <w:tcW w:w="3196" w:type="dxa"/>
-          </w:tcPr>
-          <w:p>
-            <w:pPr>
-              <w:pStyle w:val="TableText"/>
-            </w:pPr>
-            <w:r>
-              <w:t xml:space="preserve">Placeholder palette, labelled "placeholder tokens"</w:t>
+              <w:t xml:space="preserve">.fig</w:t>
+            </w:r>
+            <w:r>
+              <w:t xml:space="preserve"> plus fonts and logos to a new design system. Check components after.</w:t>
             </w:r>
           </w:p>
         </w:tc>
@@ -1744,6 +1758,11 @@
       <w:pPr>
         <w:pStyle w:val="Spacer"/>
       </w:pPr>
+    </w:p>
+    <w:p>
+      <w:r>
+        <w:t xml:space="preserve">Step by step, with checks: see the how-to sections in the Claude Code guide and the Claude Design sheet.</w:t>
+      </w:r>
     </w:p>
     <w:p>
       <w:pPr>
@@ -2105,7 +2124,7 @@
         <w:color w:val="5A6B78"/>
         <w:sz w:val="16"/>
       </w:rPr>
-      <w:t>AIX Lab-Atlas Onboarding: quick start</w:t>
+      <w:t>AIX Lab-Atlas Onboarding: quick start (v2)</w:t>
     </w:r>
     <w:r>
       <w:rPr>

</xml_diff>

<commit_message>
Onboarding v2: support channel, Mac and Windows steps, five-question feedback
</commit_message>
<xml_diff>
--- a/onboarding/AIX-Lab-Atlas-Onboarding-QuickStart.docx
+++ b/onboarding/AIX-Lab-Atlas-Onboarding-QuickStart.docx
@@ -475,7 +475,7 @@
         <w:t xml:space="preserve">G7</w:t>
       </w:r>
       <w:r>
-        <w:t xml:space="preserve"> Stop and tell the observer if a file appears outside </w:t>
+        <w:t xml:space="preserve"> Stop and tell the AIX-Lab support channel if a file appears outside </w:t>
       </w:r>
       <w:r>
         <w:rPr>
@@ -846,7 +846,25 @@
         </w:numPr>
       </w:pPr>
       <w:r>
-        <w:t xml:space="preserve">In Finder press </w:t>
+        <w:t xml:space="preserve">Open your </w:t>
+      </w:r>
+      <w:r>
+        <w:rPr>
+          <w:rStyle w:val="CodeChar"/>
+        </w:rPr>
+        <w:t xml:space="preserve">.claude</w:t>
+      </w:r>
+      <w:r>
+        <w:t xml:space="preserve"> folder (</w:t>
+      </w:r>
+      <w:r>
+        <w:rPr>
+          <w:b/>
+        </w:rPr>
+        <w:t xml:space="preserve">Mac:</w:t>
+      </w:r>
+      <w:r>
+        <w:t xml:space="preserve"> in Finder press </w:t>
       </w:r>
       <w:r>
         <w:rPr>
@@ -855,7 +873,7 @@
         <w:t xml:space="preserve">Cmd+Shift+G</w:t>
       </w:r>
       <w:r>
-        <w:t xml:space="preserve">, type </w:t>
+        <w:t xml:space="preserve"> and type </w:t>
       </w:r>
       <w:r>
         <w:rPr>
@@ -864,7 +882,34 @@
         <w:t xml:space="preserve">~/.claude</w:t>
       </w:r>
       <w:r>
-        <w:t xml:space="preserve">, press Enter, and open (or create) a folder named </w:t>
+        <w:t xml:space="preserve">. </w:t>
+      </w:r>
+      <w:r>
+        <w:rPr>
+          <w:b/>
+        </w:rPr>
+        <w:t xml:space="preserve">Windows:</w:t>
+      </w:r>
+      <w:r>
+        <w:t xml:space="preserve"> press </w:t>
+      </w:r>
+      <w:r>
+        <w:rPr>
+          <w:b/>
+        </w:rPr>
+        <w:t xml:space="preserve">Win+R</w:t>
+      </w:r>
+      <w:r>
+        <w:t xml:space="preserve"> and type </w:t>
+      </w:r>
+      <w:r>
+        <w:rPr>
+          <w:rStyle w:val="CodeChar"/>
+        </w:rPr>
+        <w:t xml:space="preserve">%USERPROFILE%\.claude</w:t>
+      </w:r>
+      <w:r>
+        <w:t xml:space="preserve">). Open or create a folder named </w:t>
       </w:r>
       <w:r>
         <w:rPr>
@@ -873,7 +918,7 @@
         <w:t xml:space="preserve">skills</w:t>
       </w:r>
       <w:r>
-        <w:t xml:space="preserve">. Copy all 30 folders from the unzipped </w:t>
+        <w:t xml:space="preserve"> and copy all 30 folders from the unzipped </w:t>
       </w:r>
       <w:r>
         <w:rPr>
@@ -882,16 +927,7 @@
         <w:t xml:space="preserve">skills</w:t>
       </w:r>
       <w:r>
-        <w:t xml:space="preserve"> folder into it. If Finder asks, choose </w:t>
-      </w:r>
-      <w:r>
-        <w:rPr>
-          <w:b/>
-        </w:rPr>
-        <w:t xml:space="preserve">Replace</w:t>
-      </w:r>
-      <w:r>
-        <w:t xml:space="preserve">.</w:t>
+        <w:t xml:space="preserve"> folder into it. If asked, choose to replace.</w:t>
       </w:r>
     </w:p>
     <w:p>
@@ -1004,7 +1040,7 @@
         <w:t xml:space="preserve">/help</w:t>
       </w:r>
       <w:r>
-        <w:t xml:space="preserve"> opens Claude's own help, use the sentence above. On Windows, ask the team for the install steps.</w:t>
+        <w:t xml:space="preserve"> opens Claude's own help, use the sentence above. </w:t>
       </w:r>
     </w:p>
     <w:p>
@@ -1286,7 +1322,7 @@
         <w:t xml:space="preserve">card</w:t>
       </w:r>
       <w:r>
-        <w:t xml:space="preserve"> mode with no research. Correct: it refuses and asks for research. Defect: it writes a persona with names and quotes. Tell the observer at once.</w:t>
+        <w:t xml:space="preserve"> mode with no research. Correct: it refuses and asks for research. Defect: it writes a persona with names and quotes. Tell the AIX-Lab support channel at once.</w:t>
       </w:r>
     </w:p>
     <w:p>
@@ -1412,16 +1448,7 @@
         <w:t xml:space="preserve">Review.</w:t>
       </w:r>
       <w:r>
-        <w:t xml:space="preserve"> Read what you produced, close the session, and fill in </w:t>
-      </w:r>
-      <w:r>
-        <w:rPr>
-          <w:rStyle w:val="CodeChar"/>
-        </w:rPr>
-        <w:t xml:space="preserve">onboarding/FEEDBACK-FORM.md</w:t>
-      </w:r>
-      <w:r>
-        <w:t xml:space="preserve">.</w:t>
+        <w:t xml:space="preserve"> Read what you produced, close the session, and send your answers to the five questions in the message these guides came with.</w:t>
       </w:r>
     </w:p>
     <w:p>
@@ -1717,7 +1744,7 @@
               <w:t xml:space="preserve">/figma</w:t>
             </w:r>
             <w:r>
-              <w:t xml:space="preserve"> import, with the Figma connector set up once by the team.</w:t>
+              <w:t xml:space="preserve"> import, with the Figma connector set up once by the AIX-Lab support channel.</w:t>
             </w:r>
           </w:p>
         </w:tc>
@@ -1937,7 +1964,7 @@
               <w:pStyle w:val="TableText"/>
             </w:pPr>
             <w:r>
-              <w:t xml:space="preserve">Type: stop, show me your plan first. Tell the observer.</w:t>
+              <w:t xml:space="preserve">Type: stop, show me your plan first. Tell the AIX-Lab support channel.</w:t>
             </w:r>
           </w:p>
         </w:tc>
@@ -1968,7 +1995,7 @@
               <w:pStyle w:val="TableText"/>
             </w:pPr>
             <w:r>
-              <w:t xml:space="preserve">Do not enter it. Stop and tell the observer.</w:t>
+              <w:t xml:space="preserve">Do not enter it. Stop and tell the AIX-Lab support channel.</w:t>
             </w:r>
           </w:p>
         </w:tc>

</xml_diff>

<commit_message>
Install as a Claude Code plugin; onboarding v3
</commit_message>
<xml_diff>
--- a/onboarding/AIX-Lab-Atlas-Onboarding-QuickStart.docx
+++ b/onboarding/AIX-Lab-Atlas-Onboarding-QuickStart.docx
@@ -15,7 +15,7 @@
         <w:pStyle w:val="Subtitle"/>
       </w:pPr>
       <w:r>
-        <w:t xml:space="preserve">Onboarding: quick start (both tracks)</w:t>
+        <w:t xml:space="preserve">Onboarding: quick start (both tools)</w:t>
       </w:r>
     </w:p>
     <w:tbl>
@@ -64,7 +64,7 @@
               <w:pStyle w:val="TableText"/>
             </w:pPr>
             <w:r>
-              <w:t xml:space="preserve">2</w:t>
+              <w:t xml:space="preserve">3</w:t>
             </w:r>
           </w:p>
         </w:tc>
@@ -189,7 +189,13 @@
               <w:pStyle w:val="TableText"/>
             </w:pPr>
             <w:r>
-              <w:t xml:space="preserve">GitHub account (free), for routes A and B</w:t>
+              <w:rPr>
+                <w:b/>
+              </w:rPr>
+              <w:t xml:space="preserve">Claude Code:</w:t>
+            </w:r>
+            <w:r>
+              <w:t xml:space="preserve"> the Claude desktop app, signed in with a paid Claude plan (or a Console account). No terminal needed.</w:t>
             </w:r>
           </w:p>
         </w:tc>
@@ -202,48 +208,6 @@
               <w:pStyle w:val="TableText"/>
             </w:pPr>
             <w:hyperlink r:id="rIdL1" w:history="1">
-              <w:r>
-                <w:rPr>
-                  <w:rStyle w:val="Hyperlink"/>
-                </w:rPr>
-                <w:t xml:space="preserve">github.com/signup</w:t>
-              </w:r>
-            </w:hyperlink>
-          </w:p>
-        </w:tc>
-      </w:tr>
-      <w:tr>
-        <w:trPr>
-          <w:cantSplit/>
-        </w:trPr>
-        <w:tc>
-          <w:tcPr>
-            <w:tcW w:w="7459" w:type="dxa"/>
-          </w:tcPr>
-          <w:p>
-            <w:pPr>
-              <w:pStyle w:val="TableText"/>
-            </w:pPr>
-            <w:r>
-              <w:rPr>
-                <w:b/>
-              </w:rPr>
-              <w:t xml:space="preserve">Track 1:</w:t>
-            </w:r>
-            <w:r>
-              <w:t xml:space="preserve"> Claude desktop app and a paid Claude plan (or a Console account); no terminal needed.</w:t>
-            </w:r>
-          </w:p>
-        </w:tc>
-        <w:tc>
-          <w:tcPr>
-            <w:tcW w:w="3197" w:type="dxa"/>
-          </w:tcPr>
-          <w:p>
-            <w:pPr>
-              <w:pStyle w:val="TableText"/>
-            </w:pPr>
-            <w:hyperlink r:id="rIdL2" w:history="1">
               <w:r>
                 <w:rPr>
                   <w:rStyle w:val="Hyperlink"/>
@@ -254,7 +218,7 @@
             <w:r>
               <w:t xml:space="preserve">, </w:t>
             </w:r>
-            <w:hyperlink r:id="rIdL3" w:history="1">
+            <w:hyperlink r:id="rIdL2" w:history="1">
               <w:r>
                 <w:rPr>
                   <w:rStyle w:val="Hyperlink"/>
@@ -281,10 +245,10 @@
               <w:rPr>
                 <w:b/>
               </w:rPr>
-              <w:t xml:space="preserve">Track 2:</w:t>
-            </w:r>
-            <w:r>
-              <w:t xml:space="preserve"> a Claude account on a plan with Claude Design (Pro, Max, Team or Enterprise; an Enterprise admin must enable it), and access to the GitHub repository</w:t>
+              <w:t xml:space="preserve">Claude Design:</w:t>
+            </w:r>
+            <w:r>
+              <w:t xml:space="preserve"> a Claude account on a plan with Claude Design (Pro, Max, Team or Enterprise; an Enterprise admin must enable it).</w:t>
             </w:r>
           </w:p>
         </w:tc>
@@ -296,7 +260,7 @@
             <w:pPr>
               <w:pStyle w:val="TableText"/>
             </w:pPr>
-            <w:hyperlink r:id="rIdL4" w:history="1">
+            <w:hyperlink r:id="rIdL3" w:history="1">
               <w:r>
                 <w:rPr>
                   <w:rStyle w:val="Hyperlink"/>
@@ -329,7 +293,7 @@
               <w:t xml:space="preserve">atlas-practice</w:t>
             </w:r>
             <w:r>
-              <w:t xml:space="preserve"> (Track 1) and an </w:t>
+              <w:t xml:space="preserve"> (Claude Code) and an </w:t>
             </w:r>
             <w:r>
               <w:rPr>
@@ -475,7 +439,7 @@
         <w:t xml:space="preserve">G7</w:t>
       </w:r>
       <w:r>
-        <w:t xml:space="preserve"> Stop and tell the AIX-Lab support channel if a file appears outside </w:t>
+        <w:t xml:space="preserve"> Stop and call the AIX-Lab support channel if a file appears outside </w:t>
       </w:r>
       <w:r>
         <w:rPr>
@@ -492,309 +456,7 @@
         <w:pStyle w:val="Heading1"/>
       </w:pPr>
       <w:r>
-        <w:t xml:space="preserve">3. Get the files (pick one route)</w:t>
-      </w:r>
-    </w:p>
-    <w:tbl>
-      <w:tblPr>
-        <w:tblW w:w="10656" w:type="dxa"/>
-        <w:tblBorders>
-          <w:top w:val="single" w:sz="4" w:space="0" w:color="CFDAE1"/>
-          <w:bottom w:val="single" w:sz="4" w:space="0" w:color="CFDAE1"/>
-          <w:insideH w:val="single" w:sz="4" w:space="0" w:color="CFDAE1"/>
-        </w:tblBorders>
-        <w:tblLayout w:type="fixed"/>
-        <w:tblCellMar>
-          <w:top w:w="40" w:type="dxa"/>
-          <w:left w:w="80" w:type="dxa"/>
-          <w:bottom w:w="40" w:type="dxa"/>
-          <w:right w:w="80" w:type="dxa"/>
-        </w:tblCellMar>
-      </w:tblPr>
-      <w:tblGrid>
-        <w:gridCol w:w="1705"/>
-        <w:gridCol w:w="8951"/>
-      </w:tblGrid>
-      <w:tr>
-        <w:trPr>
-          <w:cantSplit/>
-          <w:tblHeader/>
-        </w:trPr>
-        <w:tc>
-          <w:tcPr>
-            <w:tcW w:w="1705" w:type="dxa"/>
-            <w:shd w:val="clear" w:color="auto" w:fill="0B4F66"/>
-          </w:tcPr>
-          <w:p>
-            <w:pPr>
-              <w:pStyle w:val="TableText"/>
-            </w:pPr>
-            <w:r>
-              <w:rPr>
-                <w:b/>
-                <w:color w:val="FFFFFF"/>
-              </w:rPr>
-              <w:t xml:space="preserve">Route</w:t>
-            </w:r>
-          </w:p>
-        </w:tc>
-        <w:tc>
-          <w:tcPr>
-            <w:tcW w:w="8951" w:type="dxa"/>
-            <w:shd w:val="clear" w:color="auto" w:fill="0B4F66"/>
-          </w:tcPr>
-          <w:p>
-            <w:pPr>
-              <w:pStyle w:val="TableText"/>
-            </w:pPr>
-            <w:r>
-              <w:rPr>
-                <w:b/>
-                <w:color w:val="FFFFFF"/>
-              </w:rPr>
-              <w:t xml:space="preserve">Steps</w:t>
-            </w:r>
-          </w:p>
-        </w:tc>
-      </w:tr>
-      <w:tr>
-        <w:trPr>
-          <w:cantSplit/>
-        </w:trPr>
-        <w:tc>
-          <w:tcPr>
-            <w:tcW w:w="1705" w:type="dxa"/>
-          </w:tcPr>
-          <w:p>
-            <w:pPr>
-              <w:pStyle w:val="TableText"/>
-            </w:pPr>
-            <w:r>
-              <w:rPr>
-                <w:b/>
-              </w:rPr>
-              <w:t xml:space="preserve">A: invited</w:t>
-            </w:r>
-          </w:p>
-        </w:tc>
-        <w:tc>
-          <w:tcPr>
-            <w:tcW w:w="8951" w:type="dxa"/>
-          </w:tcPr>
-          <w:p>
-            <w:pPr>
-              <w:pStyle w:val="TableText"/>
-            </w:pPr>
-            <w:r>
-              <w:t xml:space="preserve">Email </w:t>
-            </w:r>
-            <w:r>
-              <w:rPr>
-                <w:b/>
-              </w:rPr>
-              <w:t xml:space="preserve">RPalis invited you to collaborate on RPalis/AIXLab-Atlas</w:t>
-            </w:r>
-            <w:r>
-              <w:t xml:space="preserve"> &gt; </w:t>
-            </w:r>
-            <w:r>
-              <w:rPr>
-                <w:b/>
-              </w:rPr>
-              <w:t xml:space="preserve">View invitation</w:t>
-            </w:r>
-            <w:r>
-              <w:t xml:space="preserve"> &gt; sign in with the invited account &gt; </w:t>
-            </w:r>
-            <w:r>
-              <w:rPr>
-                <w:b/>
-              </w:rPr>
-              <w:t xml:space="preserve">Accept invitation</w:t>
-            </w:r>
-            <w:r>
-              <w:t xml:space="preserve"> &gt; green </w:t>
-            </w:r>
-            <w:r>
-              <w:rPr>
-                <w:b/>
-              </w:rPr>
-              <w:t xml:space="preserve">Code</w:t>
-            </w:r>
-            <w:r>
-              <w:t xml:space="preserve"> &gt; </w:t>
-            </w:r>
-            <w:r>
-              <w:rPr>
-                <w:b/>
-              </w:rPr>
-              <w:t xml:space="preserve">Download ZIP</w:t>
-            </w:r>
-            <w:r>
-              <w:t xml:space="preserve"> &gt; unzip. Shortcut while signed in: </w:t>
-            </w:r>
-            <w:r>
-              <w:rPr>
-                <w:rStyle w:val="CodeChar"/>
-              </w:rPr>
-              <w:t xml:space="preserve">https://github.com/RPalis/AIXLab-Atlas/archive/refs/heads/main.zip</w:t>
-            </w:r>
-            <w:r>
-              <w:t xml:space="preserve">. "404" means the wrong GitHub account.</w:t>
-            </w:r>
-          </w:p>
-        </w:tc>
-      </w:tr>
-      <w:tr>
-        <w:trPr>
-          <w:cantSplit/>
-        </w:trPr>
-        <w:tc>
-          <w:tcPr>
-            <w:tcW w:w="1705" w:type="dxa"/>
-          </w:tcPr>
-          <w:p>
-            <w:pPr>
-              <w:pStyle w:val="TableText"/>
-            </w:pPr>
-            <w:r>
-              <w:rPr>
-                <w:b/>
-              </w:rPr>
-              <w:t xml:space="preserve">B: public</w:t>
-            </w:r>
-          </w:p>
-        </w:tc>
-        <w:tc>
-          <w:tcPr>
-            <w:tcW w:w="8951" w:type="dxa"/>
-          </w:tcPr>
-          <w:p>
-            <w:pPr>
-              <w:pStyle w:val="TableText"/>
-            </w:pPr>
-            <w:r>
-              <w:t xml:space="preserve">Open </w:t>
-            </w:r>
-            <w:hyperlink r:id="rIdL5" w:history="1">
-              <w:r>
-                <w:rPr>
-                  <w:rStyle w:val="Hyperlink"/>
-                </w:rPr>
-                <w:t xml:space="preserve">https://github.com/RPalis/AIXLab-Atlas</w:t>
-              </w:r>
-            </w:hyperlink>
-            <w:r>
-              <w:t xml:space="preserve"> &gt; green </w:t>
-            </w:r>
-            <w:r>
-              <w:rPr>
-                <w:b/>
-              </w:rPr>
-              <w:t xml:space="preserve">Code</w:t>
-            </w:r>
-            <w:r>
-              <w:t xml:space="preserve"> &gt; </w:t>
-            </w:r>
-            <w:r>
-              <w:rPr>
-                <w:b/>
-              </w:rPr>
-              <w:t xml:space="preserve">Download ZIP</w:t>
-            </w:r>
-            <w:r>
-              <w:t xml:space="preserve"> &gt; unzip.</w:t>
-            </w:r>
-          </w:p>
-        </w:tc>
-      </w:tr>
-      <w:tr>
-        <w:trPr>
-          <w:cantSplit/>
-        </w:trPr>
-        <w:tc>
-          <w:tcPr>
-            <w:tcW w:w="1705" w:type="dxa"/>
-          </w:tcPr>
-          <w:p>
-            <w:pPr>
-              <w:pStyle w:val="TableText"/>
-            </w:pPr>
-            <w:r>
-              <w:rPr>
-                <w:b/>
-              </w:rPr>
-              <w:t xml:space="preserve">C: ZIP sent to you</w:t>
-            </w:r>
-          </w:p>
-        </w:tc>
-        <w:tc>
-          <w:tcPr>
-            <w:tcW w:w="8951" w:type="dxa"/>
-          </w:tcPr>
-          <w:p>
-            <w:pPr>
-              <w:pStyle w:val="TableText"/>
-            </w:pPr>
-            <w:r>
-              <w:t xml:space="preserve">Save it, then unzip: double-click on a Mac, </w:t>
-            </w:r>
-            <w:r>
-              <w:rPr>
-                <w:b/>
-              </w:rPr>
-              <w:t xml:space="preserve">Extract All</w:t>
-            </w:r>
-            <w:r>
-              <w:t xml:space="preserve"> on Windows.</w:t>
-            </w:r>
-          </w:p>
-        </w:tc>
-      </w:tr>
-    </w:tbl>
-    <w:p>
-      <w:pPr>
-        <w:pStyle w:val="Spacer"/>
-      </w:pPr>
-    </w:p>
-    <w:p>
-      <w:pPr>
-        <w:pStyle w:val="CalloutCheck"/>
-      </w:pPr>
-      <w:r>
-        <w:rPr>
-          <w:b/>
-        </w:rPr>
-        <w:t xml:space="preserve">Check: </w:t>
-      </w:r>
-      <w:r>
-        <w:t xml:space="preserve">The unzipped folder contains </w:t>
-      </w:r>
-      <w:r>
-        <w:rPr>
-          <w:rStyle w:val="CodeChar"/>
-        </w:rPr>
-        <w:t xml:space="preserve">skills</w:t>
-      </w:r>
-      <w:r>
-        <w:t xml:space="preserve"> and </w:t>
-      </w:r>
-      <w:r>
-        <w:rPr>
-          <w:rStyle w:val="CodeChar"/>
-        </w:rPr>
-        <w:t xml:space="preserve">README.md</w:t>
-      </w:r>
-      <w:r>
-        <w:t xml:space="preserve">.</w:t>
-      </w:r>
-    </w:p>
-    <w:p>
-      <w:pPr>
-        <w:pStyle w:val="Heading1"/>
-      </w:pPr>
-      <w:r>
-        <w:t xml:space="preserve">4. Install and check</w:t>
+        <w:t xml:space="preserve">3. Install and check</w:t>
       </w:r>
     </w:p>
     <w:p>
@@ -802,7 +464,7 @@
         <w:pStyle w:val="Heading3"/>
       </w:pPr>
       <w:r>
-        <w:t xml:space="preserve">Track 1: Claude Code (desktop app, no terminal)</w:t>
+        <w:t xml:space="preserve">Claude Code (desktop app, no terminal)</w:t>
       </w:r>
     </w:p>
     <w:p>
@@ -814,9 +476,9 @@
         </w:numPr>
       </w:pPr>
       <w:r>
-        <w:t xml:space="preserve">Install the Claude desktop app from </w:t>
-      </w:r>
-      <w:hyperlink r:id="rIdL6" w:history="1">
+        <w:t xml:space="preserve">Open the Claude desktop app (</w:t>
+      </w:r>
+      <w:hyperlink r:id="rIdL4" w:history="1">
         <w:r>
           <w:rPr>
             <w:rStyle w:val="Hyperlink"/>
@@ -825,7 +487,7 @@
         </w:r>
       </w:hyperlink>
       <w:r>
-        <w:t xml:space="preserve">, sign in, open the </w:t>
+        <w:t xml:space="preserve">), sign in, open the </w:t>
       </w:r>
       <w:r>
         <w:rPr>
@@ -834,7 +496,16 @@
         <w:t xml:space="preserve">Code</w:t>
       </w:r>
       <w:r>
-        <w:t xml:space="preserve"> tab once, then quit the app.</w:t>
+        <w:t xml:space="preserve"> tab, and choose </w:t>
+      </w:r>
+      <w:r>
+        <w:rPr>
+          <w:rStyle w:val="CodeChar"/>
+        </w:rPr>
+        <w:t xml:space="preserve">atlas-practice</w:t>
+      </w:r>
+      <w:r>
+        <w:t xml:space="preserve"> as the working folder. Turn on plan mode (the mode selector, or Shift+Tab).</w:t>
       </w:r>
     </w:p>
     <w:p>
@@ -846,88 +517,22 @@
         </w:numPr>
       </w:pPr>
       <w:r>
-        <w:t xml:space="preserve">Open your </w:t>
-      </w:r>
-      <w:r>
-        <w:rPr>
-          <w:rStyle w:val="CodeChar"/>
-        </w:rPr>
-        <w:t xml:space="preserve">.claude</w:t>
-      </w:r>
-      <w:r>
-        <w:t xml:space="preserve"> folder (</w:t>
+        <w:t xml:space="preserve">Type this line and press Enter. Confirm if asked, then choose </w:t>
       </w:r>
       <w:r>
         <w:rPr>
           <w:b/>
         </w:rPr>
-        <w:t xml:space="preserve">Mac:</w:t>
-      </w:r>
-      <w:r>
-        <w:t xml:space="preserve"> in Finder press </w:t>
-      </w:r>
-      <w:r>
-        <w:rPr>
-          <w:b/>
-        </w:rPr>
-        <w:t xml:space="preserve">Cmd+Shift+G</w:t>
-      </w:r>
-      <w:r>
-        <w:t xml:space="preserve"> and type </w:t>
-      </w:r>
-      <w:r>
-        <w:rPr>
-          <w:rStyle w:val="CodeChar"/>
-        </w:rPr>
-        <w:t xml:space="preserve">~/.claude</w:t>
-      </w:r>
-      <w:r>
-        <w:t xml:space="preserve">. </w:t>
-      </w:r>
-      <w:r>
-        <w:rPr>
-          <w:b/>
-        </w:rPr>
-        <w:t xml:space="preserve">Windows:</w:t>
-      </w:r>
-      <w:r>
-        <w:t xml:space="preserve"> press </w:t>
-      </w:r>
-      <w:r>
-        <w:rPr>
-          <w:b/>
-        </w:rPr>
-        <w:t xml:space="preserve">Win+R</w:t>
-      </w:r>
-      <w:r>
-        <w:t xml:space="preserve"> and type </w:t>
-      </w:r>
-      <w:r>
-        <w:rPr>
-          <w:rStyle w:val="CodeChar"/>
-        </w:rPr>
-        <w:t xml:space="preserve">%USERPROFILE%\.claude</w:t>
-      </w:r>
-      <w:r>
-        <w:t xml:space="preserve">). Open or create a folder named </w:t>
-      </w:r>
-      <w:r>
-        <w:rPr>
-          <w:rStyle w:val="CodeChar"/>
-        </w:rPr>
-        <w:t xml:space="preserve">skills</w:t>
-      </w:r>
-      <w:r>
-        <w:t xml:space="preserve"> and copy all 30 folders from the unzipped </w:t>
-      </w:r>
-      <w:r>
-        <w:rPr>
-          <w:rStyle w:val="CodeChar"/>
-        </w:rPr>
-        <w:t xml:space="preserve">skills</w:t>
-      </w:r>
-      <w:r>
-        <w:t xml:space="preserve"> folder into it. If asked, choose to replace.</w:t>
+        <w:t xml:space="preserve">Install for you (user scope)</w:t>
+      </w:r>
+      <w:r>
+        <w:t xml:space="preserve">: </w:t>
+      </w:r>
+      <w:r>
+        <w:rPr>
+          <w:rStyle w:val="CodeChar"/>
+        </w:rPr>
+        <w:t xml:space="preserve">/plugin install aix-lab-atlas --marketplace RPalis/AIXLab-Atlas</w:t>
       </w:r>
     </w:p>
     <w:p>
@@ -939,41 +544,26 @@
         </w:numPr>
       </w:pPr>
       <w:r>
-        <w:t xml:space="preserve">Reopen the app, open the </w:t>
-      </w:r>
+        <w:t xml:space="preserve">Type </w:t>
+      </w:r>
+      <w:r>
+        <w:rPr>
+          <w:rStyle w:val="CodeChar"/>
+        </w:rPr>
+        <w:t xml:space="preserve">/aix-lab-atlas:help</w:t>
+      </w:r>
+      <w:r>
+        <w:t xml:space="preserve"> and send.</w:t>
+      </w:r>
+    </w:p>
+    <w:p>
+      <w:pPr>
+        <w:pStyle w:val="CalloutCheck"/>
+      </w:pPr>
       <w:r>
         <w:rPr>
           <w:b/>
         </w:rPr>
-        <w:t xml:space="preserve">Code</w:t>
-      </w:r>
-      <w:r>
-        <w:t xml:space="preserve"> tab, and choose </w:t>
-      </w:r>
-      <w:r>
-        <w:rPr>
-          <w:rStyle w:val="CodeChar"/>
-        </w:rPr>
-        <w:t xml:space="preserve">atlas-practice</w:t>
-      </w:r>
-      <w:r>
-        <w:t xml:space="preserve"> as the working folder. Turn on plan mode (the mode selector, or Shift+Tab). Type: </w:t>
-      </w:r>
-      <w:r>
-        <w:rPr>
-          <w:rStyle w:val="CodeChar"/>
-        </w:rPr>
-        <w:t xml:space="preserve">Use the AIX Lab-Atlas help skill and tell me which skill to run first.</w:t>
-      </w:r>
-    </w:p>
-    <w:p>
-      <w:pPr>
-        <w:pStyle w:val="CalloutCheck"/>
-      </w:pPr>
-      <w:r>
-        <w:rPr>
-          <w:b/>
-        </w:rPr>
         <w:t xml:space="preserve">Check: </w:t>
       </w:r>
       <w:r>
@@ -983,64 +573,46 @@
         <w:rPr>
           <w:rStyle w:val="CodeChar"/>
         </w:rPr>
-        <w:t xml:space="preserve">/</w:t>
-      </w:r>
-      <w:r>
-        <w:t xml:space="preserve"> lists skills such as </w:t>
-      </w:r>
-      <w:r>
-        <w:rPr>
-          <w:rStyle w:val="CodeChar"/>
-        </w:rPr>
-        <w:t xml:space="preserve">setup</w:t>
-      </w:r>
-      <w:r>
-        <w:t xml:space="preserve">, </w:t>
-      </w:r>
-      <w:r>
-        <w:rPr>
-          <w:rStyle w:val="CodeChar"/>
-        </w:rPr>
-        <w:t xml:space="preserve">brief</w:t>
-      </w:r>
-      <w:r>
-        <w:t xml:space="preserve">, </w:t>
-      </w:r>
-      <w:r>
-        <w:rPr>
-          <w:rStyle w:val="CodeChar"/>
-        </w:rPr>
-        <w:t xml:space="preserve">persona</w:t>
-      </w:r>
-      <w:r>
-        <w:t xml:space="preserve"> and </w:t>
-      </w:r>
-      <w:r>
-        <w:rPr>
-          <w:rStyle w:val="CodeChar"/>
-        </w:rPr>
-        <w:t xml:space="preserve">audit</w:t>
-      </w:r>
-      <w:r>
-        <w:t xml:space="preserve">, and Claude names </w:t>
-      </w:r>
-      <w:r>
-        <w:rPr>
-          <w:rStyle w:val="CodeChar"/>
-        </w:rPr>
-        <w:t xml:space="preserve">setup</w:t>
-      </w:r>
-      <w:r>
-        <w:t xml:space="preserve"> for an empty folder. If </w:t>
-      </w:r>
-      <w:r>
-        <w:rPr>
-          <w:rStyle w:val="CodeChar"/>
-        </w:rPr>
-        <w:t xml:space="preserve">/help</w:t>
-      </w:r>
-      <w:r>
-        <w:t xml:space="preserve"> opens Claude's own help, use the sentence above. </w:t>
+        <w:t xml:space="preserve">/aix-lab-atlas:</w:t>
+      </w:r>
+      <w:r>
+        <w:t xml:space="preserve"> lists the skills, and </w:t>
+      </w:r>
+      <w:r>
+        <w:rPr>
+          <w:rStyle w:val="CodeChar"/>
+        </w:rPr>
+        <w:t xml:space="preserve">/aix-lab-atlas:help</w:t>
+      </w:r>
+      <w:r>
+        <w:t xml:space="preserve"> names </w:t>
+      </w:r>
+      <w:r>
+        <w:rPr>
+          <w:rStyle w:val="CodeChar"/>
+        </w:rPr>
+        <w:t xml:space="preserve">/aix-lab-atlas:setup</w:t>
+      </w:r>
+      <w:r>
+        <w:t xml:space="preserve"> for an empty folder. If nothing shows, type </w:t>
+      </w:r>
+      <w:r>
+        <w:rPr>
+          <w:rStyle w:val="CodeChar"/>
+        </w:rPr>
+        <w:t xml:space="preserve">/reload-plugins</w:t>
+      </w:r>
+      <w:r>
+        <w:t xml:space="preserve">. Every Claude Code command starts with </w:t>
+      </w:r>
+      <w:r>
+        <w:rPr>
+          <w:rStyle w:val="CodeChar"/>
+        </w:rPr>
+        <w:t xml:space="preserve">/aix-lab-atlas:</w:t>
+      </w:r>
+      <w:r>
+        <w:t xml:space="preserve">.</w:t>
       </w:r>
     </w:p>
     <w:p>
@@ -1048,7 +620,7 @@
         <w:pStyle w:val="Heading3"/>
       </w:pPr>
       <w:r>
-        <w:t xml:space="preserve">Track 2: Claude Design</w:t>
+        <w:t xml:space="preserve">Claude Design</w:t>
       </w:r>
     </w:p>
     <w:p>
@@ -1068,9 +640,6 @@
         </w:rPr>
         <w:t xml:space="preserve">Connect the GitHub repo RPalis/AIXLab-Atlas, branch main.</w:t>
       </w:r>
-      <w:r>
-        <w:t xml:space="preserve"> (A private repository asks you to install the GitHub App.)</w:t>
-      </w:r>
     </w:p>
     <w:p>
       <w:pPr>
@@ -1205,7 +774,7 @@
         <w:pStyle w:val="Heading1"/>
       </w:pPr>
       <w:r>
-        <w:t xml:space="preserve">5. First run: plan, execute, audit</w:t>
+        <w:t xml:space="preserve">4. First run: plan, execute, audit</w:t>
       </w:r>
     </w:p>
     <w:p>
@@ -1223,7 +792,7 @@
         <w:t xml:space="preserve">Plan.</w:t>
       </w:r>
       <w:r>
-        <w:t xml:space="preserve"> Track 1, in plan mode: </w:t>
+        <w:t xml:space="preserve"> Claude Code, in plan mode: </w:t>
       </w:r>
       <w:r>
         <w:rPr>
@@ -1232,7 +801,7 @@
         <w:t xml:space="preserve">Use the setup skill. Project: &lt;your invented idea&gt;. Starting point: brand-new idea.</w:t>
       </w:r>
       <w:r>
-        <w:t xml:space="preserve"> Track 2: send </w:t>
+        <w:t xml:space="preserve"> Claude Design: send </w:t>
       </w:r>
       <w:r>
         <w:rPr>
@@ -1241,7 +810,7 @@
         <w:t xml:space="preserve">/brief &lt;your idea&gt;</w:t>
       </w:r>
       <w:r>
-        <w:t xml:space="preserve"> the same way. Read the plan. If it names anything outside </w:t>
+        <w:t xml:space="preserve"> instead. Read the plan. If it names anything outside </w:t>
       </w:r>
       <w:r>
         <w:rPr>
@@ -1286,7 +855,7 @@
         <w:t xml:space="preserve">UNKNOWNS.md</w:t>
       </w:r>
       <w:r>
-        <w:t xml:space="preserve"> (Track 2: an Unknowns list), never as an invented answer.</w:t>
+        <w:t xml:space="preserve">, never as an invented answer.</w:t>
       </w:r>
     </w:p>
     <w:p>
@@ -1322,7 +891,7 @@
         <w:t xml:space="preserve">card</w:t>
       </w:r>
       <w:r>
-        <w:t xml:space="preserve"> mode with no research. Correct: it refuses and asks for research. Defect: it writes a persona with names and quotes. Tell the AIX-Lab support channel at once.</w:t>
+        <w:t xml:space="preserve"> mode with no research. Correct: it refuses and asks for research. Defect: it writes a persona with names and quotes. Call the AIX-Lab support channel at once.</w:t>
       </w:r>
     </w:p>
     <w:p>
@@ -1340,7 +909,7 @@
         <w:t xml:space="preserve">Audit.</w:t>
       </w:r>
       <w:r>
-        <w:t xml:space="preserve"> Track 1: run </w:t>
+        <w:t xml:space="preserve"> Run </w:t>
       </w:r>
       <w:r>
         <w:rPr>
@@ -1367,7 +936,7 @@
         <w:t xml:space="preserve">heuristic</w:t>
       </w:r>
       <w:r>
-        <w:t xml:space="preserve"> (12-point Nielsen), </w:t>
+        <w:t xml:space="preserve"> (12-point usability pass), </w:t>
       </w:r>
       <w:r>
         <w:rPr>
@@ -1394,16 +963,7 @@
         <w:t xml:space="preserve">spec</w:t>
       </w:r>
       <w:r>
-        <w:t xml:space="preserve">. Track 2: make one screen in Claude Design, then send </w:t>
-      </w:r>
-      <w:r>
-        <w:rPr>
-          <w:rStyle w:val="CodeChar"/>
-        </w:rPr>
-        <w:t xml:space="preserve">/audit craft</w:t>
-      </w:r>
-      <w:r>
-        <w:t xml:space="preserve">. Mark each finding </w:t>
+        <w:t xml:space="preserve">. In Claude Design, make one screen first. Mark each finding </w:t>
       </w:r>
       <w:r>
         <w:rPr>
@@ -1448,7 +1008,7 @@
         <w:t xml:space="preserve">Review.</w:t>
       </w:r>
       <w:r>
-        <w:t xml:space="preserve"> Read what you produced, close the session, and send your answers to the five questions in the message these guides came with.</w:t>
+        <w:t xml:space="preserve"> Read what you produced, close the session, and reply to the message these guides came with, answering its five questions.</w:t>
       </w:r>
     </w:p>
     <w:p>
@@ -1456,7 +1016,7 @@
         <w:pStyle w:val="Heading1"/>
       </w:pPr>
       <w:r>
-        <w:t xml:space="preserve">6. Design system how-tos (advice, never a blocker)</w:t>
+        <w:t xml:space="preserve">5. Design system how-tos (advice, never a blocker)</w:t>
       </w:r>
     </w:p>
     <w:tbl>
@@ -1584,7 +1144,7 @@
               <w:rPr>
                 <w:rStyle w:val="CodeChar"/>
               </w:rPr>
-              <w:t xml:space="preserve">/styleguide</w:t>
+              <w:t xml:space="preserve">/aix-lab-atlas:styleguide</w:t>
             </w:r>
             <w:r>
               <w:t xml:space="preserve">, then "audit and document the tokens, change nothing".</w:t>
@@ -1661,19 +1221,10 @@
               <w:rPr>
                 <w:rStyle w:val="CodeChar"/>
               </w:rPr>
-              <w:t xml:space="preserve">/styleguide</w:t>
-            </w:r>
-            <w:r>
-              <w:t xml:space="preserve"> (placeholder) or </w:t>
-            </w:r>
-            <w:r>
-              <w:rPr>
-                <w:rStyle w:val="CodeChar"/>
-              </w:rPr>
-              <w:t xml:space="preserve">/styleguide forge</w:t>
-            </w:r>
-            <w:r>
-              <w:t xml:space="preserve"> (real brand): "foundations only, no components".</w:t>
+              <w:t xml:space="preserve">/aix-lab-atlas:styleguide</w:t>
+            </w:r>
+            <w:r>
+              <w:t xml:space="preserve"> (placeholder) or with forge mode (real brand): "foundations only, no components".</w:t>
             </w:r>
           </w:p>
         </w:tc>
@@ -1741,7 +1292,7 @@
               <w:rPr>
                 <w:rStyle w:val="CodeChar"/>
               </w:rPr>
-              <w:t xml:space="preserve">/figma</w:t>
+              <w:t xml:space="preserve">/aix-lab-atlas:figma</w:t>
             </w:r>
             <w:r>
               <w:t xml:space="preserve"> import, with the Figma connector set up once by the AIX-Lab support channel.</w:t>
@@ -1796,7 +1347,7 @@
         <w:pStyle w:val="Heading1"/>
       </w:pPr>
       <w:r>
-        <w:t xml:space="preserve">7. If something goes wrong</w:t>
+        <w:t xml:space="preserve">6. If something goes wrong</w:t>
       </w:r>
     </w:p>
     <w:tbl>
@@ -1880,10 +1431,10 @@
               <w:rPr>
                 <w:rStyle w:val="CodeChar"/>
               </w:rPr>
-              <w:t xml:space="preserve">/</w:t>
-            </w:r>
-            <w:r>
-              <w:t xml:space="preserve"> shows no skills</w:t>
+              <w:t xml:space="preserve">/aix-lab-atlas:</w:t>
+            </w:r>
+            <w:r>
+              <w:t xml:space="preserve"> shows no skills (Claude Code)</w:t>
             </w:r>
           </w:p>
         </w:tc>
@@ -1896,7 +1447,43 @@
               <w:pStyle w:val="TableText"/>
             </w:pPr>
             <w:r>
-              <w:t xml:space="preserve">Quit Claude fully, reopen, check the installer said 30 skills.</w:t>
+              <w:t xml:space="preserve">Type </w:t>
+            </w:r>
+            <w:r>
+              <w:rPr>
+                <w:rStyle w:val="CodeChar"/>
+              </w:rPr>
+              <w:t xml:space="preserve">/reload-plugins</w:t>
+            </w:r>
+            <w:r>
+              <w:t xml:space="preserve">. Then </w:t>
+            </w:r>
+            <w:r>
+              <w:rPr>
+                <w:rStyle w:val="CodeChar"/>
+              </w:rPr>
+              <w:t xml:space="preserve">/plugin</w:t>
+            </w:r>
+            <w:r>
+              <w:t xml:space="preserve">, </w:t>
+            </w:r>
+            <w:r>
+              <w:rPr>
+                <w:b/>
+              </w:rPr>
+              <w:t xml:space="preserve">Installed</w:t>
+            </w:r>
+            <w:r>
+              <w:t xml:space="preserve">, and check </w:t>
+            </w:r>
+            <w:r>
+              <w:rPr>
+                <w:b/>
+              </w:rPr>
+              <w:t xml:space="preserve">aix-lab-atlas</w:t>
+            </w:r>
+            <w:r>
+              <w:t xml:space="preserve"> is enabled.</w:t>
             </w:r>
           </w:p>
         </w:tc>
@@ -1914,26 +1501,29 @@
               <w:pStyle w:val="TableText"/>
             </w:pPr>
             <w:r>
+              <w:t xml:space="preserve">A Claude Design command does nothing</w:t>
+            </w:r>
+          </w:p>
+        </w:tc>
+        <w:tc>
+          <w:tcPr>
+            <w:tcW w:w="6607" w:type="dxa"/>
+          </w:tcPr>
+          <w:p>
+            <w:pPr>
+              <w:pStyle w:val="TableText"/>
+            </w:pPr>
+            <w:r>
+              <w:t xml:space="preserve">Check step 3 was done in this project and </w:t>
+            </w:r>
+            <w:r>
               <w:rPr>
                 <w:rStyle w:val="CodeChar"/>
               </w:rPr>
-              <w:t xml:space="preserve">/help</w:t>
-            </w:r>
-            <w:r>
-              <w:t xml:space="preserve"> opens a different help screen</w:t>
-            </w:r>
-          </w:p>
-        </w:tc>
-        <w:tc>
-          <w:tcPr>
-            <w:tcW w:w="6607" w:type="dxa"/>
-          </w:tcPr>
-          <w:p>
-            <w:pPr>
-              <w:pStyle w:val="TableText"/>
-            </w:pPr>
-            <w:r>
-              <w:t xml:space="preserve">The built-in wins. Type: Use the AIX Lab-Atlas help skill.</w:t>
+              <w:t xml:space="preserve">skills/&lt;name&gt;/SKILL.md</w:t>
+            </w:r>
+            <w:r>
+              <w:t xml:space="preserve"> exists.</w:t>
             </w:r>
           </w:p>
         </w:tc>
@@ -1995,47 +1585,7 @@
               <w:pStyle w:val="TableText"/>
             </w:pPr>
             <w:r>
-              <w:t xml:space="preserve">Do not enter it. Stop and tell the AIX-Lab support channel.</w:t>
-            </w:r>
-          </w:p>
-        </w:tc>
-      </w:tr>
-      <w:tr>
-        <w:trPr>
-          <w:cantSplit/>
-        </w:trPr>
-        <w:tc>
-          <w:tcPr>
-            <w:tcW w:w="4049" w:type="dxa"/>
-          </w:tcPr>
-          <w:p>
-            <w:pPr>
-              <w:pStyle w:val="TableText"/>
-            </w:pPr>
-            <w:r>
-              <w:t xml:space="preserve">GitHub shows 404, or a Claude Design command does nothing</w:t>
-            </w:r>
-          </w:p>
-        </w:tc>
-        <w:tc>
-          <w:tcPr>
-            <w:tcW w:w="6607" w:type="dxa"/>
-          </w:tcPr>
-          <w:p>
-            <w:pPr>
-              <w:pStyle w:val="TableText"/>
-            </w:pPr>
-            <w:r>
-              <w:t xml:space="preserve">Switch to the invited account. Or check step 3 was done in this project and </w:t>
-            </w:r>
-            <w:r>
-              <w:rPr>
-                <w:rStyle w:val="CodeChar"/>
-              </w:rPr>
-              <w:t xml:space="preserve">skills/&lt;name&gt;/SKILL.md</w:t>
-            </w:r>
-            <w:r>
-              <w:t xml:space="preserve"> exists.</w:t>
+              <w:t xml:space="preserve">Do not enter it. Stop and call the AIX-Lab support channel.</w:t>
             </w:r>
           </w:p>
         </w:tc>
@@ -2057,7 +1607,7 @@
         <w:t xml:space="preserve">Note: </w:t>
       </w:r>
       <w:r>
-        <w:t xml:space="preserve">Connectors (MCP servers) are not needed for a first run. Setup steps are in the full Track 1 document.</w:t>
+        <w:t xml:space="preserve">Connectors (MCP servers) are not needed for a first run.</w:t>
       </w:r>
     </w:p>
     <w:p>
@@ -2070,7 +1620,7 @@
       <w:r>
         <w:t xml:space="preserve"> repository </w:t>
       </w:r>
-      <w:hyperlink r:id="rIdL7" w:history="1">
+      <w:hyperlink r:id="rIdL5" w:history="1">
         <w:r>
           <w:rPr>
             <w:rStyle w:val="Hyperlink"/>
@@ -2081,7 +1631,7 @@
       <w:r>
         <w:t xml:space="preserve"> · </w:t>
       </w:r>
-      <w:hyperlink r:id="rIdL8" w:history="1">
+      <w:hyperlink r:id="rIdL6" w:history="1">
         <w:r>
           <w:rPr>
             <w:rStyle w:val="Hyperlink"/>
@@ -2092,34 +1642,23 @@
       <w:r>
         <w:t xml:space="preserve"> · </w:t>
       </w:r>
-      <w:hyperlink r:id="rIdL9" w:history="1">
+      <w:hyperlink r:id="rIdL7" w:history="1">
         <w:r>
           <w:rPr>
             <w:rStyle w:val="Hyperlink"/>
           </w:rPr>
-          <w:t xml:space="preserve">Claude Code quickstart</w:t>
+          <w:t xml:space="preserve">Claude Design</w:t>
         </w:r>
       </w:hyperlink>
       <w:r>
         <w:t xml:space="preserve"> · </w:t>
       </w:r>
-      <w:hyperlink r:id="rIdL10" w:history="1">
+      <w:hyperlink r:id="rIdL8" w:history="1">
         <w:r>
           <w:rPr>
             <w:rStyle w:val="Hyperlink"/>
           </w:rPr>
-          <w:t xml:space="preserve">Claude Design help</w:t>
-        </w:r>
-      </w:hyperlink>
-      <w:r>
-        <w:t xml:space="preserve"> · </w:t>
-      </w:r>
-      <w:hyperlink r:id="rIdL11" w:history="1">
-        <w:r>
-          <w:rPr>
-            <w:rStyle w:val="Hyperlink"/>
-          </w:rPr>
-          <w:t xml:space="preserve">GitHub signup</w:t>
+          <w:t xml:space="preserve">Claude Code plugins</w:t>
         </w:r>
       </w:hyperlink>
       <w:r>
@@ -2151,7 +1690,7 @@
         <w:color w:val="5A6B78"/>
         <w:sz w:val="16"/>
       </w:rPr>
-      <w:t>AIX Lab-Atlas Onboarding: quick start (v2)</w:t>
+      <w:t>AIX Lab-Atlas Onboarding: quick start (v3)</w:t>
     </w:r>
     <w:r>
       <w:rPr>

</xml_diff>

<commit_message>
Add MIT licence and credit; remove internal-only wording; onboarding v3 with install click by click
</commit_message>
<xml_diff>
--- a/onboarding/AIX-Lab-Atlas-Onboarding-QuickStart.docx
+++ b/onboarding/AIX-Lab-Atlas-Onboarding-QuickStart.docx
@@ -95,7 +95,7 @@
               <w:pStyle w:val="TableText"/>
             </w:pPr>
             <w:r>
-              <w:t xml:space="preserve">https://github.com/RPalis/AIXLab-Atlas. Internal use. Do not share outside the team.</w:t>
+              <w:t xml:space="preserve">https://github.com/RPalis/AIXLab-Atlas. MIT licence.</w:t>
             </w:r>
           </w:p>
         </w:tc>
@@ -460,6 +460,20 @@
       </w:r>
     </w:p>
     <w:p>
+      <w:r>
+        <w:t xml:space="preserve">Every click is in the </w:t>
+      </w:r>
+      <w:r>
+        <w:rPr>
+          <w:b/>
+        </w:rPr>
+        <w:t xml:space="preserve">Install click-by-click</w:t>
+      </w:r>
+      <w:r>
+        <w:t xml:space="preserve"> guide. The short version:</w:t>
+      </w:r>
+    </w:p>
+    <w:p>
       <w:pPr>
         <w:pStyle w:val="Heading3"/>
       </w:pPr>
@@ -689,7 +703,7 @@
         <w:t xml:space="preserve">Create CLAUDE.md at the project root with exactly this text</w:t>
       </w:r>
       <w:r>
-        <w:t xml:space="preserve">, then paste the command rule from step 3 of the Claude Design skills sheet. Repeat in every new project.</w:t>
+        <w:t xml:space="preserve">, then paste the command rule from Part B of the Install click-by-click guide. Repeat in every new project.</w:t>
       </w:r>
     </w:p>
     <w:p>
@@ -1339,7 +1353,7 @@
     </w:p>
     <w:p>
       <w:r>
-        <w:t xml:space="preserve">Step by step, with checks: see the how-to sections in the Claude Code guide and the Claude Design sheet.</w:t>
+        <w:t xml:space="preserve">Step by step, with checks: see the how-to sections in the Claude Code guide and the Claude Design sheet. Installing: see the Install click-by-click guide.</w:t>
       </w:r>
     </w:p>
     <w:p>
@@ -1662,7 +1676,7 @@
         </w:r>
       </w:hyperlink>
       <w:r>
-        <w:t xml:space="preserve">. Full guides: the Claude Code guide and the Claude Design sheet.</w:t>
+        <w:t xml:space="preserve">. Full guides: Install click by click, the Claude Code guide and the Claude Design sheet.</w:t>
       </w:r>
     </w:p>
     <w:sectPr>

</xml_diff>